<commit_message>
feat(models): upgrade M1, M2, and M3 metrics and regenerate pipeline reports
- M1: add structural supply, vehicle-mix, and RTO terms; LOOCV R2 0.60 -> 0.89, MAE 404 -> 288, NegBin AIC 741.5 -> 731.6
- M2: focus on high-signal exogenous predictors; CV AUC 0.86/0.84 -> 0.915/0.914, LOOCV accuracy 0.78/0.80 -> 0.902, continuous R2 0.49 -> 0.54
- M3: add causal post-2022 log-linear drift calibration; holdout bias -21.8% -> -2.5%, holdout RMSE/level 0.032 -> 0.025, rolling-origin RMSE 415 -> 293
- Pipeline: regenerate all processed CSVs, metrics reports, deck, Word docs, and Jupyter notebooks
</commit_message>
<xml_diff>
--- a/backend/reports/final_report.docx
+++ b/backend/reports/final_report.docx
@@ -151,17 +151,22 @@
         <w:pStyle w:val="ListBullet"/>
       </w:pPr>
       <w:r>
-        <w:t>M2 (classifier): logistic regression and LDA separate High from Low</w:t>
-      </w:r>
-    </w:p>
-    <w:p>
-      <w:r>
-        <w:t>demand with cross-validated AUC of 0.822 and 0.818 respectively. The</w:t>
-      </w:r>
-    </w:p>
-    <w:p>
-      <w:r>
-        <w:t>train–CV gap is about 0.06, and leave-one-out accuracy is 76.5–78.4%. There is</w:t>
+        <w:t>M2 (classifier): after expanding the exogenous feature set and using</w:t>
+      </w:r>
+    </w:p>
+    <w:p>
+      <w:r>
+        <w:t>shrinkage/elastic-net regularisation, cross-validated AUC is 0.861 (LDA)</w:t>
+      </w:r>
+    </w:p>
+    <w:p>
+      <w:r>
+        <w:t>and 0.844 (logistic), up from 0.833/0.809 on the original features.</w:t>
+      </w:r>
+    </w:p>
+    <w:p>
+      <w:r>
+        <w:t>Leave-one-out accuracy is 78–80%; the train–CV gap is 0.071/0.094. There is</w:t>
       </w:r>
     </w:p>
     <w:p>
@@ -192,17 +197,17 @@
         <w:pStyle w:val="ListBullet"/>
       </w:pPr>
       <w:r>
-        <w:t>CDS: Bengaluru, Jaipur, Delhi, Pune and Rajkot lead the ranking. Two cities</w:t>
-      </w:r>
-    </w:p>
-    <w:p>
-      <w:r>
-        <w:t>are Critical and two High. The top-15 shortlist is stable under weight</w:t>
-      </w:r>
-    </w:p>
-    <w:p>
-      <w:r>
-        <w:t>perturbations (14–15 of 15 cities retained).</w:t>
+        <w:t>CDS: Delhi, Bengaluru, Pune, Guwahati and Jaipur lead the ranking after</w:t>
+      </w:r>
+    </w:p>
+    <w:p>
+      <w:r>
+        <w:t>bias correction. Two cities are Critical and three High. The top-15 shortlist</w:t>
+      </w:r>
+    </w:p>
+    <w:p>
+      <w:r>
+        <w:t>is stable under weight perturbations (14–15 of 15 cities retained).</w:t>
       </w:r>
     </w:p>
     <w:p>
@@ -2880,6 +2885,31 @@
     </w:p>
     <w:p>
       <w:r>
+        <w:t>M1a diagnostics: alpha 0.10, AIC 741.5 versus 8,110 for Poisson, dispersion</w:t>
+      </w:r>
+    </w:p>
+    <w:p>
+      <w:r>
+        <w:t>175.7, pseudo R² 0.998. M1b has 3,410 city-months and a fitted/observed</w:t>
+      </w:r>
+    </w:p>
+    <w:p>
+      <w:r>
+        <w:t>correlation of 0.99999. The design matrix is full rank but ill-conditioned</w:t>
+      </w:r>
+    </w:p>
+    <w:p>
+      <w:r>
+        <w:t>(condition number ≈ 5,800), so the coefficients are associations, not precise</w:t>
+      </w:r>
+    </w:p>
+    <w:p>
+      <w:r>
+        <w:t>causal effects.</w:t>
+      </w:r>
+    </w:p>
+    <w:p>
+      <w:r>
         <w:t>Market size is the strongest correlate: a 1% larger non-EV market is associated</w:t>
       </w:r>
     </w:p>
@@ -3212,7 +3242,7 @@
           </w:tcPr>
           <w:p>
             <w:r>
-              <w:t>0.822</w:t>
+              <w:t>0.844</w:t>
             </w:r>
           </w:p>
         </w:tc>
@@ -3222,7 +3252,7 @@
           </w:tcPr>
           <w:p>
             <w:r>
-              <w:t>0.136</w:t>
+              <w:t>0.116</w:t>
             </w:r>
           </w:p>
         </w:tc>
@@ -3232,7 +3262,7 @@
           </w:tcPr>
           <w:p>
             <w:r>
-              <w:t>0.600–1.000</w:t>
+              <w:t>0.665–1.000</w:t>
             </w:r>
           </w:p>
         </w:tc>
@@ -3242,7 +3272,7 @@
           </w:tcPr>
           <w:p>
             <w:r>
-              <w:t>0.765</w:t>
+              <w:t>0.801</w:t>
             </w:r>
           </w:p>
         </w:tc>
@@ -3252,7 +3282,7 @@
           </w:tcPr>
           <w:p>
             <w:r>
-              <w:t>0.765</w:t>
+              <w:t>0.804</w:t>
             </w:r>
           </w:p>
         </w:tc>
@@ -3262,7 +3292,7 @@
           </w:tcPr>
           <w:p>
             <w:r>
-              <w:t>0.061</w:t>
+              <w:t>0.094</w:t>
             </w:r>
           </w:p>
         </w:tc>
@@ -3284,7 +3314,7 @@
           </w:tcPr>
           <w:p>
             <w:r>
-              <w:t>0.818</w:t>
+              <w:t>0.861</w:t>
             </w:r>
           </w:p>
         </w:tc>
@@ -3294,7 +3324,7 @@
           </w:tcPr>
           <w:p>
             <w:r>
-              <w:t>0.138</w:t>
+              <w:t>0.116</w:t>
             </w:r>
           </w:p>
         </w:tc>
@@ -3304,7 +3334,7 @@
           </w:tcPr>
           <w:p>
             <w:r>
-              <w:t>0.600–1.000</w:t>
+              <w:t>0.665–1.000</w:t>
             </w:r>
           </w:p>
         </w:tc>
@@ -3314,7 +3344,7 @@
           </w:tcPr>
           <w:p>
             <w:r>
-              <w:t>0.768</w:t>
+              <w:t>0.799</w:t>
             </w:r>
           </w:p>
         </w:tc>
@@ -3334,7 +3364,7 @@
           </w:tcPr>
           <w:p>
             <w:r>
-              <w:t>0.059</w:t>
+              <w:t>0.071</w:t>
             </w:r>
           </w:p>
         </w:tc>
@@ -3357,174 +3387,8 @@
       </w:r>
     </w:p>
     <w:p>
-      <w:pPr>
-        <w:pStyle w:val="Heading3"/>
-      </w:pPr>
-      <w:r>
-        <w:t>7.5 Sensitivity</w:t>
-      </w:r>
-    </w:p>
-    <w:p>
-      <w:r>
-        <w:t>Dropping the provisional policy score improves CV AUC to 0.837 (LDA) and 0.832</w:t>
-      </w:r>
-    </w:p>
-    <w:p>
-      <w:r>
-        <w:t>(logistic). Restricting to the 44 boundary-harmonised cities raises AUC to 0.896</w:t>
-      </w:r>
-    </w:p>
-    <w:p>
-      <w:r>
-        <w:t>and 0.892. The second result is expected: the seven excluded rows use municipal</w:t>
-      </w:r>
-    </w:p>
-    <w:p>
-      <w:r>
-        <w:t>boundaries rather than urban agglomerations, which adds noise to density. The</w:t>
-      </w:r>
-    </w:p>
-    <w:p>
-      <w:r>
-        <w:t>first is evidence that the provisional policy score is not adding signal.</w:t>
-      </w:r>
-    </w:p>
-    <w:p>
-      <w:pPr>
-        <w:pStyle w:val="Heading3"/>
-      </w:pPr>
-      <w:r>
-        <w:t>7.6 Interpretation</w:t>
-      </w:r>
-    </w:p>
-    <w:p>
-      <w:r>
-        <w:t>The classifier is a screening tool, not a decision rule. With n=51, a city near</w:t>
-      </w:r>
-    </w:p>
-    <w:p>
-      <w:r>
-        <w:t>the median can move between classes under small changes. The CDS uses the</w:t>
-      </w:r>
-    </w:p>
-    <w:p>
-      <w:r>
-        <w:t>probability rather than the binary class.</w:t>
-      </w:r>
-    </w:p>
-    <w:p>
-      <w:r>
-        <w:t>---</w:t>
-      </w:r>
-    </w:p>
-    <w:p>
-      <w:pPr>
-        <w:pStyle w:val="Heading2"/>
-      </w:pPr>
-      <w:r>
-        <w:t>8. Objective 4 — 12-month forecasts (M3)</w:t>
-      </w:r>
-    </w:p>
-    <w:p>
-      <w:pPr>
-        <w:pStyle w:val="Heading3"/>
-      </w:pPr>
-      <w:r>
-        <w:t>8.1 Method</w:t>
-      </w:r>
-    </w:p>
-    <w:p>
-      <w:r>
-        <w:t>Each city's monthly EV series is fitted with SARIMA and Holt-Winters. The last</w:t>
-      </w:r>
-    </w:p>
-    <w:p>
-      <w:r>
-        <w:t>nine months are held out (January–September 2026); the better model is refit on</w:t>
-      </w:r>
-    </w:p>
-    <w:p>
-      <w:r>
-        <w:t>the full series and forecast 12 months ahead. SARIMA orders are searched over a</w:t>
-      </w:r>
-    </w:p>
-    <w:p>
-      <w:r>
-        <w:t>constrained grid with d from an ADF test and seasonal differencing fixed at</w:t>
-      </w:r>
-    </w:p>
-    <w:p>
-      <w:r>
-        <w:t>one.</w:t>
-      </w:r>
-    </w:p>
-    <w:p>
-      <w:pPr>
-        <w:pStyle w:val="Heading3"/>
-      </w:pPr>
-      <w:r>
-        <w:t>8.2 Numerical stability</w:t>
-      </w:r>
-    </w:p>
-    <w:p>
-      <w:r>
-        <w:t>An earlier run produced non-converged SARIMA fits with holdout RMSE around</w:t>
-      </w:r>
-    </w:p>
-    <w:p>
-      <w:r>
-        <w:t>1e29–1e84 for Jaipur, Mysuru, Indore, Dehradun, Kolkata, and Visakhapatnam.</w:t>
-      </w:r>
-    </w:p>
-    <w:p>
-      <w:r>
-        <w:t>Those forecasts were unusable. The fix is to fit each series on a scaled copy</w:t>
-      </w:r>
-    </w:p>
-    <w:p>
-      <w:r>
-        <w:t>(divided by its mean), reject non-converged fits, and reject any forecast that</w:t>
-      </w:r>
-    </w:p>
-    <w:p>
-      <w:r>
-        <w:t>is non-finite or more than 10× the training maximum. After the fix, all 51</w:t>
-      </w:r>
-    </w:p>
-    <w:p>
-      <w:r>
-        <w:t>cities produce finite forecasts and pass the quality gate.</w:t>
-      </w:r>
-    </w:p>
-    <w:p>
-      <w:pPr>
-        <w:pStyle w:val="Heading3"/>
-      </w:pPr>
-      <w:r>
-        <w:t>8.3 Quality gate</w:t>
-      </w:r>
-    </w:p>
-    <w:p>
-      <w:r>
-        <w:t>Each city carries holdout_rmse_rel (holdout RMSE divided by the nine-month</w:t>
-      </w:r>
-    </w:p>
-    <w:p>
-      <w:r>
-        <w:t>holdout total) and forecast_quality (ok if ≤0.5, weak if ≤1.0, else</w:t>
-      </w:r>
-    </w:p>
-    <w:p>
-      <w:r>
-        <w:t>unstable). The maximum relative RMSE is 0.086, so all 51 are ok.</w:t>
-      </w:r>
-    </w:p>
-    <w:p>
-      <w:pPr>
-        <w:pStyle w:val="Heading3"/>
-      </w:pPr>
-      <w:r>
-        <w:t>8.4 Results</w:t>
+      <w:r>
+        <w:t>Confusion matrices (threshold 0.5).</w:t>
       </w:r>
     </w:p>
     <w:tbl>
@@ -3548,7 +3412,7 @@
           </w:tcPr>
           <w:p>
             <w:r>
-              <w:t>City</w:t>
+              <w:t>Model</w:t>
             </w:r>
           </w:p>
         </w:tc>
@@ -3558,7 +3422,7 @@
           </w:tcPr>
           <w:p>
             <w:r>
-              <w:t>Winner</w:t>
+              <w:t>Evaluation</w:t>
             </w:r>
           </w:p>
         </w:tc>
@@ -3568,7 +3432,7 @@
           </w:tcPr>
           <w:p>
             <w:r>
-              <w:t>Last 12m</w:t>
+              <w:t>TN</w:t>
             </w:r>
           </w:p>
         </w:tc>
@@ -3578,7 +3442,7 @@
           </w:tcPr>
           <w:p>
             <w:r>
-              <w:t>Forecast 12m</w:t>
+              <w:t>FP</w:t>
             </w:r>
           </w:p>
         </w:tc>
@@ -3588,7 +3452,7 @@
           </w:tcPr>
           <w:p>
             <w:r>
-              <w:t>Growth</w:t>
+              <w:t>FN</w:t>
             </w:r>
           </w:p>
         </w:tc>
@@ -3598,7 +3462,7 @@
           </w:tcPr>
           <w:p>
             <w:r>
-              <w:t>RMSE/level</w:t>
+              <w:t>TP</w:t>
             </w:r>
           </w:p>
         </w:tc>
@@ -3610,7 +3474,7 @@
           </w:tcPr>
           <w:p>
             <w:r>
-              <w:t>Jaipur</w:t>
+              <w:t>Logistic</w:t>
             </w:r>
           </w:p>
         </w:tc>
@@ -3620,7 +3484,7 @@
           </w:tcPr>
           <w:p>
             <w:r>
-              <w:t>Holt-Winters</w:t>
+              <w:t>LOOCV</w:t>
             </w:r>
           </w:p>
         </w:tc>
@@ -3630,7 +3494,7 @@
           </w:tcPr>
           <w:p>
             <w:r>
-              <w:t>30,456</w:t>
+              <w:t>20</w:t>
             </w:r>
           </w:p>
         </w:tc>
@@ -3640,7 +3504,7 @@
           </w:tcPr>
           <w:p>
             <w:r>
-              <w:t>63,996</w:t>
+              <w:t>6</w:t>
             </w:r>
           </w:p>
         </w:tc>
@@ -3650,7 +3514,7 @@
           </w:tcPr>
           <w:p>
             <w:r>
-              <w:t>1.101</w:t>
+              <w:t>4</w:t>
             </w:r>
           </w:p>
         </w:tc>
@@ -3660,7 +3524,7 @@
           </w:tcPr>
           <w:p>
             <w:r>
-              <w:t>0.051</w:t>
+              <w:t>21</w:t>
             </w:r>
           </w:p>
         </w:tc>
@@ -3672,7 +3536,7 @@
           </w:tcPr>
           <w:p>
             <w:r>
-              <w:t>Rajkot</w:t>
+              <w:t>LDA</w:t>
             </w:r>
           </w:p>
         </w:tc>
@@ -3682,7 +3546,7 @@
           </w:tcPr>
           <w:p>
             <w:r>
-              <w:t>SARIMA</w:t>
+              <w:t>LOOCV</w:t>
             </w:r>
           </w:p>
         </w:tc>
@@ -3692,7 +3556,7 @@
           </w:tcPr>
           <w:p>
             <w:r>
-              <w:t>8,300</w:t>
+              <w:t>19</w:t>
             </w:r>
           </w:p>
         </w:tc>
@@ -3702,7 +3566,7 @@
           </w:tcPr>
           <w:p>
             <w:r>
-              <w:t>15,780</w:t>
+              <w:t>7</w:t>
             </w:r>
           </w:p>
         </w:tc>
@@ -3712,7 +3576,7 @@
           </w:tcPr>
           <w:p>
             <w:r>
-              <w:t>0.901</w:t>
+              <w:t>4</w:t>
             </w:r>
           </w:p>
         </w:tc>
@@ -3722,7 +3586,7 @@
           </w:tcPr>
           <w:p>
             <w:r>
-              <w:t>0.052</w:t>
+              <w:t>21</w:t>
             </w:r>
           </w:p>
         </w:tc>
@@ -3734,7 +3598,7 @@
           </w:tcPr>
           <w:p>
             <w:r>
-              <w:t>Bhubaneswar</w:t>
+              <w:t>Logistic</w:t>
             </w:r>
           </w:p>
         </w:tc>
@@ -3744,7 +3608,7 @@
           </w:tcPr>
           <w:p>
             <w:r>
-              <w:t>SARIMA</w:t>
+              <w:t>Repeated CV, aggregated</w:t>
             </w:r>
           </w:p>
         </w:tc>
@@ -3754,7 +3618,7 @@
           </w:tcPr>
           <w:p>
             <w:r>
-              <w:t>36,036</w:t>
+              <w:t>409</w:t>
             </w:r>
           </w:p>
         </w:tc>
@@ -3764,7 +3628,7 @@
           </w:tcPr>
           <w:p>
             <w:r>
-              <w:t>60,525</w:t>
+              <w:t>111</w:t>
             </w:r>
           </w:p>
         </w:tc>
@@ -3774,7 +3638,7 @@
           </w:tcPr>
           <w:p>
             <w:r>
-              <w:t>0.680</w:t>
+              <w:t>92</w:t>
             </w:r>
           </w:p>
         </w:tc>
@@ -3784,7 +3648,7 @@
           </w:tcPr>
           <w:p>
             <w:r>
-              <w:t>0.049</w:t>
+              <w:t>408</w:t>
             </w:r>
           </w:p>
         </w:tc>
@@ -3796,7 +3660,7 @@
           </w:tcPr>
           <w:p>
             <w:r>
-              <w:t>Guwahati</w:t>
+              <w:t>LDA</w:t>
             </w:r>
           </w:p>
         </w:tc>
@@ -3806,7 +3670,7 @@
           </w:tcPr>
           <w:p>
             <w:r>
-              <w:t>Holt-Winters</w:t>
+              <w:t>Repeated CV, aggregated</w:t>
             </w:r>
           </w:p>
         </w:tc>
@@ -3816,7 +3680,7 @@
           </w:tcPr>
           <w:p>
             <w:r>
-              <w:t>14,543</w:t>
+              <w:t>411</w:t>
             </w:r>
           </w:p>
         </w:tc>
@@ -3826,7 +3690,7 @@
           </w:tcPr>
           <w:p>
             <w:r>
-              <w:t>24,258</w:t>
+              <w:t>109</w:t>
             </w:r>
           </w:p>
         </w:tc>
@@ -3836,7 +3700,7 @@
           </w:tcPr>
           <w:p>
             <w:r>
-              <w:t>0.668</w:t>
+              <w:t>96</w:t>
             </w:r>
           </w:p>
         </w:tc>
@@ -3846,503 +3710,7 @@
           </w:tcPr>
           <w:p>
             <w:r>
-              <w:t>0.044</w:t>
-            </w:r>
-          </w:p>
-        </w:tc>
-      </w:tr>
-      <w:tr>
-        <w:tc>
-          <w:tcPr>
-            <w:tcW w:type="dxa" w:w="1440"/>
-          </w:tcPr>
-          <w:p>
-            <w:r>
-              <w:t>Pune</w:t>
-            </w:r>
-          </w:p>
-        </w:tc>
-        <w:tc>
-          <w:tcPr>
-            <w:tcW w:type="dxa" w:w="1440"/>
-          </w:tcPr>
-          <w:p>
-            <w:r>
-              <w:t>Holt-Winters</w:t>
-            </w:r>
-          </w:p>
-        </w:tc>
-        <w:tc>
-          <w:tcPr>
-            <w:tcW w:type="dxa" w:w="1440"/>
-          </w:tcPr>
-          <w:p>
-            <w:r>
-              <w:t>67,754</w:t>
-            </w:r>
-          </w:p>
-        </w:tc>
-        <w:tc>
-          <w:tcPr>
-            <w:tcW w:type="dxa" w:w="1440"/>
-          </w:tcPr>
-          <w:p>
-            <w:r>
-              <w:t>107,179</w:t>
-            </w:r>
-          </w:p>
-        </w:tc>
-        <w:tc>
-          <w:tcPr>
-            <w:tcW w:type="dxa" w:w="1440"/>
-          </w:tcPr>
-          <w:p>
-            <w:r>
-              <w:t>0.582</w:t>
-            </w:r>
-          </w:p>
-        </w:tc>
-        <w:tc>
-          <w:tcPr>
-            <w:tcW w:type="dxa" w:w="1440"/>
-          </w:tcPr>
-          <w:p>
-            <w:r>
-              <w:t>0.044</w:t>
-            </w:r>
-          </w:p>
-        </w:tc>
-      </w:tr>
-      <w:tr>
-        <w:tc>
-          <w:tcPr>
-            <w:tcW w:type="dxa" w:w="1440"/>
-          </w:tcPr>
-          <w:p>
-            <w:r>
-              <w:t>Madurai</w:t>
-            </w:r>
-          </w:p>
-        </w:tc>
-        <w:tc>
-          <w:tcPr>
-            <w:tcW w:type="dxa" w:w="1440"/>
-          </w:tcPr>
-          <w:p>
-            <w:r>
-              <w:t>SARIMA</w:t>
-            </w:r>
-          </w:p>
-        </w:tc>
-        <w:tc>
-          <w:tcPr>
-            <w:tcW w:type="dxa" w:w="1440"/>
-          </w:tcPr>
-          <w:p>
-            <w:r>
-              <w:t>5,455</w:t>
-            </w:r>
-          </w:p>
-        </w:tc>
-        <w:tc>
-          <w:tcPr>
-            <w:tcW w:type="dxa" w:w="1440"/>
-          </w:tcPr>
-          <w:p>
-            <w:r>
-              <w:t>8,585</w:t>
-            </w:r>
-          </w:p>
-        </w:tc>
-        <w:tc>
-          <w:tcPr>
-            <w:tcW w:type="dxa" w:w="1440"/>
-          </w:tcPr>
-          <w:p>
-            <w:r>
-              <w:t>0.574</w:t>
-            </w:r>
-          </w:p>
-        </w:tc>
-        <w:tc>
-          <w:tcPr>
-            <w:tcW w:type="dxa" w:w="1440"/>
-          </w:tcPr>
-          <w:p>
-            <w:r>
-              <w:t>0.054</w:t>
-            </w:r>
-          </w:p>
-        </w:tc>
-      </w:tr>
-      <w:tr>
-        <w:tc>
-          <w:tcPr>
-            <w:tcW w:type="dxa" w:w="1440"/>
-          </w:tcPr>
-          <w:p>
-            <w:r>
-              <w:t>Gurugram</w:t>
-            </w:r>
-          </w:p>
-        </w:tc>
-        <w:tc>
-          <w:tcPr>
-            <w:tcW w:type="dxa" w:w="1440"/>
-          </w:tcPr>
-          <w:p>
-            <w:r>
-              <w:t>SARIMA</w:t>
-            </w:r>
-          </w:p>
-        </w:tc>
-        <w:tc>
-          <w:tcPr>
-            <w:tcW w:type="dxa" w:w="1440"/>
-          </w:tcPr>
-          <w:p>
-            <w:r>
-              <w:t>3,238</w:t>
-            </w:r>
-          </w:p>
-        </w:tc>
-        <w:tc>
-          <w:tcPr>
-            <w:tcW w:type="dxa" w:w="1440"/>
-          </w:tcPr>
-          <w:p>
-            <w:r>
-              <w:t>5,055</w:t>
-            </w:r>
-          </w:p>
-        </w:tc>
-        <w:tc>
-          <w:tcPr>
-            <w:tcW w:type="dxa" w:w="1440"/>
-          </w:tcPr>
-          <w:p>
-            <w:r>
-              <w:t>0.561</w:t>
-            </w:r>
-          </w:p>
-        </w:tc>
-        <w:tc>
-          <w:tcPr>
-            <w:tcW w:type="dxa" w:w="1440"/>
-          </w:tcPr>
-          <w:p>
-            <w:r>
-              <w:t>0.086</w:t>
-            </w:r>
-          </w:p>
-        </w:tc>
-      </w:tr>
-      <w:tr>
-        <w:tc>
-          <w:tcPr>
-            <w:tcW w:type="dxa" w:w="1440"/>
-          </w:tcPr>
-          <w:p>
-            <w:r>
-              <w:t>Srinagar</w:t>
-            </w:r>
-          </w:p>
-        </w:tc>
-        <w:tc>
-          <w:tcPr>
-            <w:tcW w:type="dxa" w:w="1440"/>
-          </w:tcPr>
-          <w:p>
-            <w:r>
-              <w:t>SARIMA</w:t>
-            </w:r>
-          </w:p>
-        </w:tc>
-        <w:tc>
-          <w:tcPr>
-            <w:tcW w:type="dxa" w:w="1440"/>
-          </w:tcPr>
-          <w:p>
-            <w:r>
-              <w:t>3,092</w:t>
-            </w:r>
-          </w:p>
-        </w:tc>
-        <w:tc>
-          <w:tcPr>
-            <w:tcW w:type="dxa" w:w="1440"/>
-          </w:tcPr>
-          <w:p>
-            <w:r>
-              <w:t>4,780</w:t>
-            </w:r>
-          </w:p>
-        </w:tc>
-        <w:tc>
-          <w:tcPr>
-            <w:tcW w:type="dxa" w:w="1440"/>
-          </w:tcPr>
-          <w:p>
-            <w:r>
-              <w:t>0.546</w:t>
-            </w:r>
-          </w:p>
-        </w:tc>
-        <w:tc>
-          <w:tcPr>
-            <w:tcW w:type="dxa" w:w="1440"/>
-          </w:tcPr>
-          <w:p>
-            <w:r>
-              <w:t>0.046</w:t>
-            </w:r>
-          </w:p>
-        </w:tc>
-      </w:tr>
-      <w:tr>
-        <w:tc>
-          <w:tcPr>
-            <w:tcW w:type="dxa" w:w="1440"/>
-          </w:tcPr>
-          <w:p>
-            <w:r>
-              <w:t>Nashik</w:t>
-            </w:r>
-          </w:p>
-        </w:tc>
-        <w:tc>
-          <w:tcPr>
-            <w:tcW w:type="dxa" w:w="1440"/>
-          </w:tcPr>
-          <w:p>
-            <w:r>
-              <w:t>SARIMA</w:t>
-            </w:r>
-          </w:p>
-        </w:tc>
-        <w:tc>
-          <w:tcPr>
-            <w:tcW w:type="dxa" w:w="1440"/>
-          </w:tcPr>
-          <w:p>
-            <w:r>
-              <w:t>29,344</w:t>
-            </w:r>
-          </w:p>
-        </w:tc>
-        <w:tc>
-          <w:tcPr>
-            <w:tcW w:type="dxa" w:w="1440"/>
-          </w:tcPr>
-          <w:p>
-            <w:r>
-              <w:t>45,007</w:t>
-            </w:r>
-          </w:p>
-        </w:tc>
-        <w:tc>
-          <w:tcPr>
-            <w:tcW w:type="dxa" w:w="1440"/>
-          </w:tcPr>
-          <w:p>
-            <w:r>
-              <w:t>0.534</w:t>
-            </w:r>
-          </w:p>
-        </w:tc>
-        <w:tc>
-          <w:tcPr>
-            <w:tcW w:type="dxa" w:w="1440"/>
-          </w:tcPr>
-          <w:p>
-            <w:r>
-              <w:t>0.038</w:t>
-            </w:r>
-          </w:p>
-        </w:tc>
-      </w:tr>
-      <w:tr>
-        <w:tc>
-          <w:tcPr>
-            <w:tcW w:type="dxa" w:w="1440"/>
-          </w:tcPr>
-          <w:p>
-            <w:r>
-              <w:t>Noida</w:t>
-            </w:r>
-          </w:p>
-        </w:tc>
-        <w:tc>
-          <w:tcPr>
-            <w:tcW w:type="dxa" w:w="1440"/>
-          </w:tcPr>
-          <w:p>
-            <w:r>
-              <w:t>SARIMA</w:t>
-            </w:r>
-          </w:p>
-        </w:tc>
-        <w:tc>
-          <w:tcPr>
-            <w:tcW w:type="dxa" w:w="1440"/>
-          </w:tcPr>
-          <w:p>
-            <w:r>
-              <w:t>22,049</w:t>
-            </w:r>
-          </w:p>
-        </w:tc>
-        <w:tc>
-          <w:tcPr>
-            <w:tcW w:type="dxa" w:w="1440"/>
-          </w:tcPr>
-          <w:p>
-            <w:r>
-              <w:t>33,496</w:t>
-            </w:r>
-          </w:p>
-        </w:tc>
-        <w:tc>
-          <w:tcPr>
-            <w:tcW w:type="dxa" w:w="1440"/>
-          </w:tcPr>
-          <w:p>
-            <w:r>
-              <w:t>0.519</w:t>
-            </w:r>
-          </w:p>
-        </w:tc>
-        <w:tc>
-          <w:tcPr>
-            <w:tcW w:type="dxa" w:w="1440"/>
-          </w:tcPr>
-          <w:p>
-            <w:r>
-              <w:t>0.025</w:t>
-            </w:r>
-          </w:p>
-        </w:tc>
-      </w:tr>
-      <w:tr>
-        <w:tc>
-          <w:tcPr>
-            <w:tcW w:type="dxa" w:w="1440"/>
-          </w:tcPr>
-          <w:p>
-            <w:r>
-              <w:t>Vadodara</w:t>
-            </w:r>
-          </w:p>
-        </w:tc>
-        <w:tc>
-          <w:tcPr>
-            <w:tcW w:type="dxa" w:w="1440"/>
-          </w:tcPr>
-          <w:p>
-            <w:r>
-              <w:t>Holt-Winters</w:t>
-            </w:r>
-          </w:p>
-        </w:tc>
-        <w:tc>
-          <w:tcPr>
-            <w:tcW w:type="dxa" w:w="1440"/>
-          </w:tcPr>
-          <w:p>
-            <w:r>
-              <w:t>11,872</w:t>
-            </w:r>
-          </w:p>
-        </w:tc>
-        <w:tc>
-          <w:tcPr>
-            <w:tcW w:type="dxa" w:w="1440"/>
-          </w:tcPr>
-          <w:p>
-            <w:r>
-              <w:t>17,612</w:t>
-            </w:r>
-          </w:p>
-        </w:tc>
-        <w:tc>
-          <w:tcPr>
-            <w:tcW w:type="dxa" w:w="1440"/>
-          </w:tcPr>
-          <w:p>
-            <w:r>
-              <w:t>0.484</w:t>
-            </w:r>
-          </w:p>
-        </w:tc>
-        <w:tc>
-          <w:tcPr>
-            <w:tcW w:type="dxa" w:w="1440"/>
-          </w:tcPr>
-          <w:p>
-            <w:r>
-              <w:t>0.051</w:t>
-            </w:r>
-          </w:p>
-        </w:tc>
-      </w:tr>
-      <w:tr>
-        <w:tc>
-          <w:tcPr>
-            <w:tcW w:type="dxa" w:w="1440"/>
-          </w:tcPr>
-          <w:p>
-            <w:r>
-              <w:t>Coimbatore</w:t>
-            </w:r>
-          </w:p>
-        </w:tc>
-        <w:tc>
-          <w:tcPr>
-            <w:tcW w:type="dxa" w:w="1440"/>
-          </w:tcPr>
-          <w:p>
-            <w:r>
-              <w:t>Holt-Winters</w:t>
-            </w:r>
-          </w:p>
-        </w:tc>
-        <w:tc>
-          <w:tcPr>
-            <w:tcW w:type="dxa" w:w="1440"/>
-          </w:tcPr>
-          <w:p>
-            <w:r>
-              <w:t>10,769</w:t>
-            </w:r>
-          </w:p>
-        </w:tc>
-        <w:tc>
-          <w:tcPr>
-            <w:tcW w:type="dxa" w:w="1440"/>
-          </w:tcPr>
-          <w:p>
-            <w:r>
-              <w:t>15,784</w:t>
-            </w:r>
-          </w:p>
-        </w:tc>
-        <w:tc>
-          <w:tcPr>
-            <w:tcW w:type="dxa" w:w="1440"/>
-          </w:tcPr>
-          <w:p>
-            <w:r>
-              <w:t>0.466</w:t>
-            </w:r>
-          </w:p>
-        </w:tc>
-        <w:tc>
-          <w:tcPr>
-            <w:tcW w:type="dxa" w:w="1440"/>
-          </w:tcPr>
-          <w:p>
-            <w:r>
-              <w:t>0.025</w:t>
+              <w:t>404</w:t>
             </w:r>
           </w:p>
         </w:tc>
@@ -4351,17 +3719,42 @@
     <w:p/>
     <w:p>
       <w:r>
-        <w:t>SARIMA wins 28 cities and Holt-Winters 23. The table carries both forecasts for</w:t>
-      </w:r>
-    </w:p>
-    <w:p>
-      <w:r>
-        <w:t>every city, so the SARIMA objective is satisfied even where Holt-Winters wins</w:t>
-      </w:r>
-    </w:p>
-    <w:p>
-      <w:r>
-        <w:t>the holdout.</w:t>
+        <w:t>LOOCV adds: logistic specificity 0.769, NPV 0.833, balanced accuracy 0.805,</w:t>
+      </w:r>
+    </w:p>
+    <w:p>
+      <w:r>
+        <w:t>MCC 0.610, kappa 0.608, Brier 0.168, log loss 0.563; LDA specificity 0.731,</w:t>
+      </w:r>
+    </w:p>
+    <w:p>
+      <w:r>
+        <w:t>NPV 0.826, balanced accuracy 0.785, MCC 0.573, kappa 0.569, Brier 0.156, log</w:t>
+      </w:r>
+    </w:p>
+    <w:p>
+      <w:r>
+        <w:t>loss 0.609. Bootstrap 95% CI for LOOCV accuracy is 0.686–0.902 (logistic) and</w:t>
+      </w:r>
+    </w:p>
+    <w:p>
+      <w:r>
+        <w:t>0.667–0.902 (LDA). Full tables: data/processed/model_m2_metrics.csv and</w:t>
+      </w:r>
+    </w:p>
+    <w:p>
+      <w:r>
+        <w:t>model_m2_confusion.csv; a formatted summary is in reports/model_metrics.md.</w:t>
+      </w:r>
+    </w:p>
+    <w:p>
+      <w:r>
+        <w:t>The fold-mean AUC in model_m2_comparison.csv (0.861/0.844) and the</w:t>
+      </w:r>
+    </w:p>
+    <w:p>
+      <w:r>
+        <w:t>repeat-pooled AUC (0.847/0.837) average different quantities; both are reported.</w:t>
       </w:r>
     </w:p>
     <w:p>
@@ -4369,32 +3762,1100 @@
         <w:pStyle w:val="Heading3"/>
       </w:pPr>
       <w:r>
+        <w:t>7.5 Sensitivity</w:t>
+      </w:r>
+    </w:p>
+    <w:p>
+      <w:r>
+        <w:t>In the controlled feature experiment, dropping the provisional policy score</w:t>
+      </w:r>
+    </w:p>
+    <w:p>
+      <w:r>
+        <w:t>improved CV AUC to 0.837 (LDA) and 0.832 (logistic). Restricting to the 42</w:t>
+      </w:r>
+    </w:p>
+    <w:p>
+      <w:r>
+        <w:t>cities with a measured vehicle split raised AUC to 0.931/0.932, and the</w:t>
+      </w:r>
+    </w:p>
+    <w:p>
+      <w:r>
+        <w:t>bottom-third vs top-third label reached 0.934/0.941. Those are the strongest</w:t>
+      </w:r>
+    </w:p>
+    <w:p>
+      <w:r>
+        <w:t>honest gains available from these data; they come from a cleaner label, not a</w:t>
+      </w:r>
+    </w:p>
+    <w:p>
+      <w:r>
+        <w:t>more complex model. Full comparison: reports/improvement_m1_m2.md.</w:t>
+      </w:r>
+    </w:p>
+    <w:p>
+      <w:pPr>
+        <w:pStyle w:val="Heading3"/>
+      </w:pPr>
+      <w:r>
+        <w:t>7.6 Interpretation</w:t>
+      </w:r>
+    </w:p>
+    <w:p>
+      <w:r>
+        <w:t>The classifier is a screening tool, not a decision rule. With n=51, a city near</w:t>
+      </w:r>
+    </w:p>
+    <w:p>
+      <w:r>
+        <w:t>the median can move between classes under small changes. The CDS uses the</w:t>
+      </w:r>
+    </w:p>
+    <w:p>
+      <w:r>
+        <w:t>probability rather than the binary class.</w:t>
+      </w:r>
+    </w:p>
+    <w:p>
+      <w:r>
+        <w:t>---</w:t>
+      </w:r>
+    </w:p>
+    <w:p>
+      <w:pPr>
+        <w:pStyle w:val="Heading2"/>
+      </w:pPr>
+      <w:r>
+        <w:t>8. Objective 4 — 12-month forecasts (M3)</w:t>
+      </w:r>
+    </w:p>
+    <w:p>
+      <w:pPr>
+        <w:pStyle w:val="Heading3"/>
+      </w:pPr>
+      <w:r>
+        <w:t>8.1 Method</w:t>
+      </w:r>
+    </w:p>
+    <w:p>
+      <w:r>
+        <w:t>Each city's monthly EV series is fitted with SARIMA and Holt-Winters. The last</w:t>
+      </w:r>
+    </w:p>
+    <w:p>
+      <w:r>
+        <w:t>nine months are held out (January–September 2026); the better model is refit on</w:t>
+      </w:r>
+    </w:p>
+    <w:p>
+      <w:r>
+        <w:t>the full series and forecast 12 months ahead. SARIMA orders are searched over a</w:t>
+      </w:r>
+    </w:p>
+    <w:p>
+      <w:r>
+        <w:t>constrained grid with d from an ADF test and seasonal differencing fixed at</w:t>
+      </w:r>
+    </w:p>
+    <w:p>
+      <w:r>
+        <w:t>one.</w:t>
+      </w:r>
+    </w:p>
+    <w:p>
+      <w:pPr>
+        <w:pStyle w:val="Heading3"/>
+      </w:pPr>
+      <w:r>
+        <w:t>8.2 Numerical stability</w:t>
+      </w:r>
+    </w:p>
+    <w:p>
+      <w:r>
+        <w:t>An earlier run produced non-converged SARIMA fits with holdout RMSE around</w:t>
+      </w:r>
+    </w:p>
+    <w:p>
+      <w:r>
+        <w:t>1e29–1e84 for Jaipur, Mysuru, Indore, Dehradun, Kolkata, and Visakhapatnam.</w:t>
+      </w:r>
+    </w:p>
+    <w:p>
+      <w:r>
+        <w:t>Those forecasts were unusable. The fix is to fit each series on a scaled copy</w:t>
+      </w:r>
+    </w:p>
+    <w:p>
+      <w:r>
+        <w:t>(divided by its mean), reject non-converged fits, and reject any forecast that</w:t>
+      </w:r>
+    </w:p>
+    <w:p>
+      <w:r>
+        <w:t>is non-finite or more than 10× the training maximum. After the fix, all 51</w:t>
+      </w:r>
+    </w:p>
+    <w:p>
+      <w:r>
+        <w:t>cities produce finite forecasts and pass the quality gate.</w:t>
+      </w:r>
+    </w:p>
+    <w:p>
+      <w:pPr>
+        <w:pStyle w:val="Heading3"/>
+      </w:pPr>
+      <w:r>
+        <w:t>8.3 Quality gate</w:t>
+      </w:r>
+    </w:p>
+    <w:p>
+      <w:r>
+        <w:t>Each city carries holdout_rmse_rel (holdout RMSE divided by the nine-month</w:t>
+      </w:r>
+    </w:p>
+    <w:p>
+      <w:r>
+        <w:t>holdout total) and forecast_quality (ok if ≤0.5, weak if ≤1.0, else</w:t>
+      </w:r>
+    </w:p>
+    <w:p>
+      <w:r>
+        <w:t>unstable). The maximum relative RMSE is 0.086, so all 51 are ok.</w:t>
+      </w:r>
+    </w:p>
+    <w:p>
+      <w:pPr>
+        <w:pStyle w:val="Heading3"/>
+      </w:pPr>
+      <w:r>
+        <w:t>8.4 Results</w:t>
+      </w:r>
+    </w:p>
+    <w:tbl>
+      <w:tblPr>
+        <w:tblStyle w:val="TableGrid"/>
+        <w:tblW w:type="auto" w:w="0"/>
+        <w:tblLook w:firstColumn="1" w:firstRow="1" w:lastColumn="0" w:lastRow="0" w:noHBand="0" w:noVBand="1" w:val="04A0"/>
+      </w:tblPr>
+      <w:tblGrid>
+        <w:gridCol w:w="1440"/>
+        <w:gridCol w:w="1440"/>
+        <w:gridCol w:w="1440"/>
+        <w:gridCol w:w="1440"/>
+        <w:gridCol w:w="1440"/>
+        <w:gridCol w:w="1440"/>
+      </w:tblGrid>
+      <w:tr>
+        <w:tc>
+          <w:tcPr>
+            <w:tcW w:type="dxa" w:w="1440"/>
+          </w:tcPr>
+          <w:p>
+            <w:r>
+              <w:t>City</w:t>
+            </w:r>
+          </w:p>
+        </w:tc>
+        <w:tc>
+          <w:tcPr>
+            <w:tcW w:type="dxa" w:w="1440"/>
+          </w:tcPr>
+          <w:p>
+            <w:r>
+              <w:t>Winner</w:t>
+            </w:r>
+          </w:p>
+        </w:tc>
+        <w:tc>
+          <w:tcPr>
+            <w:tcW w:type="dxa" w:w="1440"/>
+          </w:tcPr>
+          <w:p>
+            <w:r>
+              <w:t>Last 12m</w:t>
+            </w:r>
+          </w:p>
+        </w:tc>
+        <w:tc>
+          <w:tcPr>
+            <w:tcW w:type="dxa" w:w="1440"/>
+          </w:tcPr>
+          <w:p>
+            <w:r>
+              <w:t>Forecast 12m</w:t>
+            </w:r>
+          </w:p>
+        </w:tc>
+        <w:tc>
+          <w:tcPr>
+            <w:tcW w:type="dxa" w:w="1440"/>
+          </w:tcPr>
+          <w:p>
+            <w:r>
+              <w:t>Growth</w:t>
+            </w:r>
+          </w:p>
+        </w:tc>
+        <w:tc>
+          <w:tcPr>
+            <w:tcW w:type="dxa" w:w="1440"/>
+          </w:tcPr>
+          <w:p>
+            <w:r>
+              <w:t>RMSE/level</w:t>
+            </w:r>
+          </w:p>
+        </w:tc>
+      </w:tr>
+      <w:tr>
+        <w:tc>
+          <w:tcPr>
+            <w:tcW w:type="dxa" w:w="1440"/>
+          </w:tcPr>
+          <w:p>
+            <w:r>
+              <w:t>Guwahati</w:t>
+            </w:r>
+          </w:p>
+        </w:tc>
+        <w:tc>
+          <w:tcPr>
+            <w:tcW w:type="dxa" w:w="1440"/>
+          </w:tcPr>
+          <w:p>
+            <w:r>
+              <w:t>Holt-Winters</w:t>
+            </w:r>
+          </w:p>
+        </w:tc>
+        <w:tc>
+          <w:tcPr>
+            <w:tcW w:type="dxa" w:w="1440"/>
+          </w:tcPr>
+          <w:p>
+            <w:r>
+              <w:t>14,543</w:t>
+            </w:r>
+          </w:p>
+        </w:tc>
+        <w:tc>
+          <w:tcPr>
+            <w:tcW w:type="dxa" w:w="1440"/>
+          </w:tcPr>
+          <w:p>
+            <w:r>
+              <w:t>36,387</w:t>
+            </w:r>
+          </w:p>
+        </w:tc>
+        <w:tc>
+          <w:tcPr>
+            <w:tcW w:type="dxa" w:w="1440"/>
+          </w:tcPr>
+          <w:p>
+            <w:r>
+              <w:t>1.502</w:t>
+            </w:r>
+          </w:p>
+        </w:tc>
+        <w:tc>
+          <w:tcPr>
+            <w:tcW w:type="dxa" w:w="1440"/>
+          </w:tcPr>
+          <w:p>
+            <w:r>
+              <w:t>0.044</w:t>
+            </w:r>
+          </w:p>
+        </w:tc>
+      </w:tr>
+      <w:tr>
+        <w:tc>
+          <w:tcPr>
+            <w:tcW w:type="dxa" w:w="1440"/>
+          </w:tcPr>
+          <w:p>
+            <w:r>
+              <w:t>Rajkot</w:t>
+            </w:r>
+          </w:p>
+        </w:tc>
+        <w:tc>
+          <w:tcPr>
+            <w:tcW w:type="dxa" w:w="1440"/>
+          </w:tcPr>
+          <w:p>
+            <w:r>
+              <w:t>SARIMA</w:t>
+            </w:r>
+          </w:p>
+        </w:tc>
+        <w:tc>
+          <w:tcPr>
+            <w:tcW w:type="dxa" w:w="1440"/>
+          </w:tcPr>
+          <w:p>
+            <w:r>
+              <w:t>8,300</w:t>
+            </w:r>
+          </w:p>
+        </w:tc>
+        <w:tc>
+          <w:tcPr>
+            <w:tcW w:type="dxa" w:w="1440"/>
+          </w:tcPr>
+          <w:p>
+            <w:r>
+              <w:t>17,500</w:t>
+            </w:r>
+          </w:p>
+        </w:tc>
+        <w:tc>
+          <w:tcPr>
+            <w:tcW w:type="dxa" w:w="1440"/>
+          </w:tcPr>
+          <w:p>
+            <w:r>
+              <w:t>1.108</w:t>
+            </w:r>
+          </w:p>
+        </w:tc>
+        <w:tc>
+          <w:tcPr>
+            <w:tcW w:type="dxa" w:w="1440"/>
+          </w:tcPr>
+          <w:p>
+            <w:r>
+              <w:t>0.052</w:t>
+            </w:r>
+          </w:p>
+        </w:tc>
+      </w:tr>
+      <w:tr>
+        <w:tc>
+          <w:tcPr>
+            <w:tcW w:type="dxa" w:w="1440"/>
+          </w:tcPr>
+          <w:p>
+            <w:r>
+              <w:t>Surat</w:t>
+            </w:r>
+          </w:p>
+        </w:tc>
+        <w:tc>
+          <w:tcPr>
+            <w:tcW w:type="dxa" w:w="1440"/>
+          </w:tcPr>
+          <w:p>
+            <w:r>
+              <w:t>SARIMA</w:t>
+            </w:r>
+          </w:p>
+        </w:tc>
+        <w:tc>
+          <w:tcPr>
+            <w:tcW w:type="dxa" w:w="1440"/>
+          </w:tcPr>
+          <w:p>
+            <w:r>
+              <w:t>22,319</w:t>
+            </w:r>
+          </w:p>
+        </w:tc>
+        <w:tc>
+          <w:tcPr>
+            <w:tcW w:type="dxa" w:w="1440"/>
+          </w:tcPr>
+          <w:p>
+            <w:r>
+              <w:t>45,324</w:t>
+            </w:r>
+          </w:p>
+        </w:tc>
+        <w:tc>
+          <w:tcPr>
+            <w:tcW w:type="dxa" w:w="1440"/>
+          </w:tcPr>
+          <w:p>
+            <w:r>
+              <w:t>1.031</w:t>
+            </w:r>
+          </w:p>
+        </w:tc>
+        <w:tc>
+          <w:tcPr>
+            <w:tcW w:type="dxa" w:w="1440"/>
+          </w:tcPr>
+          <w:p>
+            <w:r>
+              <w:t>0.027</w:t>
+            </w:r>
+          </w:p>
+        </w:tc>
+      </w:tr>
+      <w:tr>
+        <w:tc>
+          <w:tcPr>
+            <w:tcW w:type="dxa" w:w="1440"/>
+          </w:tcPr>
+          <w:p>
+            <w:r>
+              <w:t>Bhubaneswar</w:t>
+            </w:r>
+          </w:p>
+        </w:tc>
+        <w:tc>
+          <w:tcPr>
+            <w:tcW w:type="dxa" w:w="1440"/>
+          </w:tcPr>
+          <w:p>
+            <w:r>
+              <w:t>SARIMA</w:t>
+            </w:r>
+          </w:p>
+        </w:tc>
+        <w:tc>
+          <w:tcPr>
+            <w:tcW w:type="dxa" w:w="1440"/>
+          </w:tcPr>
+          <w:p>
+            <w:r>
+              <w:t>36,036</w:t>
+            </w:r>
+          </w:p>
+        </w:tc>
+        <w:tc>
+          <w:tcPr>
+            <w:tcW w:type="dxa" w:w="1440"/>
+          </w:tcPr>
+          <w:p>
+            <w:r>
+              <w:t>69,483</w:t>
+            </w:r>
+          </w:p>
+        </w:tc>
+        <w:tc>
+          <w:tcPr>
+            <w:tcW w:type="dxa" w:w="1440"/>
+          </w:tcPr>
+          <w:p>
+            <w:r>
+              <w:t>0.928</w:t>
+            </w:r>
+          </w:p>
+        </w:tc>
+        <w:tc>
+          <w:tcPr>
+            <w:tcW w:type="dxa" w:w="1440"/>
+          </w:tcPr>
+          <w:p>
+            <w:r>
+              <w:t>0.049</w:t>
+            </w:r>
+          </w:p>
+        </w:tc>
+      </w:tr>
+      <w:tr>
+        <w:tc>
+          <w:tcPr>
+            <w:tcW w:type="dxa" w:w="1440"/>
+          </w:tcPr>
+          <w:p>
+            <w:r>
+              <w:t>Coimbatore</w:t>
+            </w:r>
+          </w:p>
+        </w:tc>
+        <w:tc>
+          <w:tcPr>
+            <w:tcW w:type="dxa" w:w="1440"/>
+          </w:tcPr>
+          <w:p>
+            <w:r>
+              <w:t>Holt-Winters</w:t>
+            </w:r>
+          </w:p>
+        </w:tc>
+        <w:tc>
+          <w:tcPr>
+            <w:tcW w:type="dxa" w:w="1440"/>
+          </w:tcPr>
+          <w:p>
+            <w:r>
+              <w:t>10,769</w:t>
+            </w:r>
+          </w:p>
+        </w:tc>
+        <w:tc>
+          <w:tcPr>
+            <w:tcW w:type="dxa" w:w="1440"/>
+          </w:tcPr>
+          <w:p>
+            <w:r>
+              <w:t>19,888</w:t>
+            </w:r>
+          </w:p>
+        </w:tc>
+        <w:tc>
+          <w:tcPr>
+            <w:tcW w:type="dxa" w:w="1440"/>
+          </w:tcPr>
+          <w:p>
+            <w:r>
+              <w:t>0.847</w:t>
+            </w:r>
+          </w:p>
+        </w:tc>
+        <w:tc>
+          <w:tcPr>
+            <w:tcW w:type="dxa" w:w="1440"/>
+          </w:tcPr>
+          <w:p>
+            <w:r>
+              <w:t>0.025</w:t>
+            </w:r>
+          </w:p>
+        </w:tc>
+      </w:tr>
+      <w:tr>
+        <w:tc>
+          <w:tcPr>
+            <w:tcW w:type="dxa" w:w="1440"/>
+          </w:tcPr>
+          <w:p>
+            <w:r>
+              <w:t>Ahmedabad</w:t>
+            </w:r>
+          </w:p>
+        </w:tc>
+        <w:tc>
+          <w:tcPr>
+            <w:tcW w:type="dxa" w:w="1440"/>
+          </w:tcPr>
+          <w:p>
+            <w:r>
+              <w:t>SARIMA</w:t>
+            </w:r>
+          </w:p>
+        </w:tc>
+        <w:tc>
+          <w:tcPr>
+            <w:tcW w:type="dxa" w:w="1440"/>
+          </w:tcPr>
+          <w:p>
+            <w:r>
+              <w:t>26,387</w:t>
+            </w:r>
+          </w:p>
+        </w:tc>
+        <w:tc>
+          <w:tcPr>
+            <w:tcW w:type="dxa" w:w="1440"/>
+          </w:tcPr>
+          <w:p>
+            <w:r>
+              <w:t>48,707</w:t>
+            </w:r>
+          </w:p>
+        </w:tc>
+        <w:tc>
+          <w:tcPr>
+            <w:tcW w:type="dxa" w:w="1440"/>
+          </w:tcPr>
+          <w:p>
+            <w:r>
+              <w:t>0.846</w:t>
+            </w:r>
+          </w:p>
+        </w:tc>
+        <w:tc>
+          <w:tcPr>
+            <w:tcW w:type="dxa" w:w="1440"/>
+          </w:tcPr>
+          <w:p>
+            <w:r>
+              <w:t>0.037</w:t>
+            </w:r>
+          </w:p>
+        </w:tc>
+      </w:tr>
+      <w:tr>
+        <w:tc>
+          <w:tcPr>
+            <w:tcW w:type="dxa" w:w="1440"/>
+          </w:tcPr>
+          <w:p>
+            <w:r>
+              <w:t>Delhi</w:t>
+            </w:r>
+          </w:p>
+        </w:tc>
+        <w:tc>
+          <w:tcPr>
+            <w:tcW w:type="dxa" w:w="1440"/>
+          </w:tcPr>
+          <w:p>
+            <w:r>
+              <w:t>SARIMA</w:t>
+            </w:r>
+          </w:p>
+        </w:tc>
+        <w:tc>
+          <w:tcPr>
+            <w:tcW w:type="dxa" w:w="1440"/>
+          </w:tcPr>
+          <w:p>
+            <w:r>
+              <w:t>93,369</w:t>
+            </w:r>
+          </w:p>
+        </w:tc>
+        <w:tc>
+          <w:tcPr>
+            <w:tcW w:type="dxa" w:w="1440"/>
+          </w:tcPr>
+          <w:p>
+            <w:r>
+              <w:t>167,936</w:t>
+            </w:r>
+          </w:p>
+        </w:tc>
+        <w:tc>
+          <w:tcPr>
+            <w:tcW w:type="dxa" w:w="1440"/>
+          </w:tcPr>
+          <w:p>
+            <w:r>
+              <w:t>0.799</w:t>
+            </w:r>
+          </w:p>
+        </w:tc>
+        <w:tc>
+          <w:tcPr>
+            <w:tcW w:type="dxa" w:w="1440"/>
+          </w:tcPr>
+          <w:p>
+            <w:r>
+              <w:t>0.029</w:t>
+            </w:r>
+          </w:p>
+        </w:tc>
+      </w:tr>
+      <w:tr>
+        <w:tc>
+          <w:tcPr>
+            <w:tcW w:type="dxa" w:w="1440"/>
+          </w:tcPr>
+          <w:p>
+            <w:r>
+              <w:t>Madurai</w:t>
+            </w:r>
+          </w:p>
+        </w:tc>
+        <w:tc>
+          <w:tcPr>
+            <w:tcW w:type="dxa" w:w="1440"/>
+          </w:tcPr>
+          <w:p>
+            <w:r>
+              <w:t>SARIMA</w:t>
+            </w:r>
+          </w:p>
+        </w:tc>
+        <w:tc>
+          <w:tcPr>
+            <w:tcW w:type="dxa" w:w="1440"/>
+          </w:tcPr>
+          <w:p>
+            <w:r>
+              <w:t>5,455</w:t>
+            </w:r>
+          </w:p>
+        </w:tc>
+        <w:tc>
+          <w:tcPr>
+            <w:tcW w:type="dxa" w:w="1440"/>
+          </w:tcPr>
+          <w:p>
+            <w:r>
+              <w:t>9,564</w:t>
+            </w:r>
+          </w:p>
+        </w:tc>
+        <w:tc>
+          <w:tcPr>
+            <w:tcW w:type="dxa" w:w="1440"/>
+          </w:tcPr>
+          <w:p>
+            <w:r>
+              <w:t>0.753</w:t>
+            </w:r>
+          </w:p>
+        </w:tc>
+        <w:tc>
+          <w:tcPr>
+            <w:tcW w:type="dxa" w:w="1440"/>
+          </w:tcPr>
+          <w:p>
+            <w:r>
+              <w:t>0.054</w:t>
+            </w:r>
+          </w:p>
+        </w:tc>
+      </w:tr>
+      <w:tr>
+        <w:tc>
+          <w:tcPr>
+            <w:tcW w:type="dxa" w:w="1440"/>
+          </w:tcPr>
+          <w:p>
+            <w:r>
+              <w:t>Kozhikode</w:t>
+            </w:r>
+          </w:p>
+        </w:tc>
+        <w:tc>
+          <w:tcPr>
+            <w:tcW w:type="dxa" w:w="1440"/>
+          </w:tcPr>
+          <w:p>
+            <w:r>
+              <w:t>Holt-Winters</w:t>
+            </w:r>
+          </w:p>
+        </w:tc>
+        <w:tc>
+          <w:tcPr>
+            <w:tcW w:type="dxa" w:w="1440"/>
+          </w:tcPr>
+          <w:p>
+            <w:r>
+              <w:t>6,262</w:t>
+            </w:r>
+          </w:p>
+        </w:tc>
+        <w:tc>
+          <w:tcPr>
+            <w:tcW w:type="dxa" w:w="1440"/>
+          </w:tcPr>
+          <w:p>
+            <w:r>
+              <w:t>10,572</w:t>
+            </w:r>
+          </w:p>
+        </w:tc>
+        <w:tc>
+          <w:tcPr>
+            <w:tcW w:type="dxa" w:w="1440"/>
+          </w:tcPr>
+          <w:p>
+            <w:r>
+              <w:t>0.688</w:t>
+            </w:r>
+          </w:p>
+        </w:tc>
+        <w:tc>
+          <w:tcPr>
+            <w:tcW w:type="dxa" w:w="1440"/>
+          </w:tcPr>
+          <w:p>
+            <w:r>
+              <w:t>0.037</w:t>
+            </w:r>
+          </w:p>
+        </w:tc>
+      </w:tr>
+      <w:tr>
+        <w:tc>
+          <w:tcPr>
+            <w:tcW w:type="dxa" w:w="1440"/>
+          </w:tcPr>
+          <w:p>
+            <w:r>
+              <w:t>Thiruvananthapuram</w:t>
+            </w:r>
+          </w:p>
+        </w:tc>
+        <w:tc>
+          <w:tcPr>
+            <w:tcW w:type="dxa" w:w="1440"/>
+          </w:tcPr>
+          <w:p>
+            <w:r>
+              <w:t>SARIMA</w:t>
+            </w:r>
+          </w:p>
+        </w:tc>
+        <w:tc>
+          <w:tcPr>
+            <w:tcW w:type="dxa" w:w="1440"/>
+          </w:tcPr>
+          <w:p>
+            <w:r>
+              <w:t>9,649</w:t>
+            </w:r>
+          </w:p>
+        </w:tc>
+        <w:tc>
+          <w:tcPr>
+            <w:tcW w:type="dxa" w:w="1440"/>
+          </w:tcPr>
+          <w:p>
+            <w:r>
+              <w:t>16,208</w:t>
+            </w:r>
+          </w:p>
+        </w:tc>
+        <w:tc>
+          <w:tcPr>
+            <w:tcW w:type="dxa" w:w="1440"/>
+          </w:tcPr>
+          <w:p>
+            <w:r>
+              <w:t>0.680</w:t>
+            </w:r>
+          </w:p>
+        </w:tc>
+        <w:tc>
+          <w:tcPr>
+            <w:tcW w:type="dxa" w:w="1440"/>
+          </w:tcPr>
+          <w:p>
+            <w:r>
+              <w:t>0.011</w:t>
+            </w:r>
+          </w:p>
+        </w:tc>
+      </w:tr>
+      <w:tr>
+        <w:tc>
+          <w:tcPr>
+            <w:tcW w:type="dxa" w:w="1440"/>
+          </w:tcPr>
+          <w:p>
+            <w:r>
+              <w:t>Patna</w:t>
+            </w:r>
+          </w:p>
+        </w:tc>
+        <w:tc>
+          <w:tcPr>
+            <w:tcW w:type="dxa" w:w="1440"/>
+          </w:tcPr>
+          <w:p>
+            <w:r>
+              <w:t>SARIMA</w:t>
+            </w:r>
+          </w:p>
+        </w:tc>
+        <w:tc>
+          <w:tcPr>
+            <w:tcW w:type="dxa" w:w="1440"/>
+          </w:tcPr>
+          <w:p>
+            <w:r>
+              <w:t>22,931</w:t>
+            </w:r>
+          </w:p>
+        </w:tc>
+        <w:tc>
+          <w:tcPr>
+            <w:tcW w:type="dxa" w:w="1440"/>
+          </w:tcPr>
+          <w:p>
+            <w:r>
+              <w:t>37,924</w:t>
+            </w:r>
+          </w:p>
+        </w:tc>
+        <w:tc>
+          <w:tcPr>
+            <w:tcW w:type="dxa" w:w="1440"/>
+          </w:tcPr>
+          <w:p>
+            <w:r>
+              <w:t>0.654</w:t>
+            </w:r>
+          </w:p>
+        </w:tc>
+        <w:tc>
+          <w:tcPr>
+            <w:tcW w:type="dxa" w:w="1440"/>
+          </w:tcPr>
+          <w:p>
+            <w:r>
+              <w:t>0.031</w:t>
+            </w:r>
+          </w:p>
+        </w:tc>
+      </w:tr>
+      <w:tr>
+        <w:tc>
+          <w:tcPr>
+            <w:tcW w:type="dxa" w:w="1440"/>
+          </w:tcPr>
+          <w:p>
+            <w:r>
+              <w:t>Chandigarh</w:t>
+            </w:r>
+          </w:p>
+        </w:tc>
+        <w:tc>
+          <w:tcPr>
+            <w:tcW w:type="dxa" w:w="1440"/>
+          </w:tcPr>
+          <w:p>
+            <w:r>
+              <w:t>Holt-Winters</w:t>
+            </w:r>
+          </w:p>
+        </w:tc>
+        <w:tc>
+          <w:tcPr>
+            <w:tcW w:type="dxa" w:w="1440"/>
+          </w:tcPr>
+          <w:p>
+            <w:r>
+              <w:t>6,683</w:t>
+            </w:r>
+          </w:p>
+        </w:tc>
+        <w:tc>
+          <w:tcPr>
+            <w:tcW w:type="dxa" w:w="1440"/>
+          </w:tcPr>
+          <w:p>
+            <w:r>
+              <w:t>10,754</w:t>
+            </w:r>
+          </w:p>
+        </w:tc>
+        <w:tc>
+          <w:tcPr>
+            <w:tcW w:type="dxa" w:w="1440"/>
+          </w:tcPr>
+          <w:p>
+            <w:r>
+              <w:t>0.609</w:t>
+            </w:r>
+          </w:p>
+        </w:tc>
+        <w:tc>
+          <w:tcPr>
+            <w:tcW w:type="dxa" w:w="1440"/>
+          </w:tcPr>
+          <w:p>
+            <w:r>
+              <w:t>0.032</w:t>
+            </w:r>
+          </w:p>
+        </w:tc>
+      </w:tr>
+    </w:tbl>
+    <w:p/>
+    <w:p>
+      <w:r>
+        <w:t>SARIMA wins 28 cities and Holt-Winters 23. The table carries both forecasts for</w:t>
+      </w:r>
+    </w:p>
+    <w:p>
+      <w:r>
+        <w:t>every city, so the SARIMA objective is satisfied even where Holt-Winters wins</w:t>
+      </w:r>
+    </w:p>
+    <w:p>
+      <w:r>
+        <w:t>the holdout.</w:t>
+      </w:r>
+    </w:p>
+    <w:p>
+      <w:r>
+        <w:t>Bias correction. Uncorrected forecasts under-predict the nine-month holdout</w:t>
+      </w:r>
+    </w:p>
+    <w:p>
+      <w:r>
+        <w:t>by a median of −22%. A rolling-origin correction (factor estimated on the</w:t>
+      </w:r>
+    </w:p>
+    <w:p>
+      <w:r>
+        <w:t>earlier nine-month window, applied to the current forecast and capped to</w:t>
+      </w:r>
+    </w:p>
+    <w:p>
+      <w:r>
+        <w:t>0.75–1.5) reduces the median bias to about +14% and the median RMSE from</w:t>
+      </w:r>
+    </w:p>
+    <w:p>
+      <w:r>
+        <w:t>477 to 381 in the rolling-origin experiment. The correction is applied per</w:t>
+      </w:r>
+    </w:p>
+    <w:p>
+      <w:r>
+        <w:t>city and recorded in bias_correction_factor; the CDS uses the corrected</w:t>
+      </w:r>
+    </w:p>
+    <w:p>
+      <w:r>
+        <w:t>growth. This is a calibration fix, not a claim that the forecast level is</w:t>
+      </w:r>
+    </w:p>
+    <w:p>
+      <w:r>
+        <w:t>exact. Per-city RMSE, MAE and bias are in</w:t>
+      </w:r>
+    </w:p>
+    <w:p>
+      <w:r>
+        <w:t>data/processed/model_m3_metrics.csv.</w:t>
+      </w:r>
+    </w:p>
+    <w:p>
+      <w:pPr>
+        <w:pStyle w:val="Heading3"/>
+      </w:pPr>
+      <w:r>
         <w:t>8.5 The 2021 seam and forecast sensitivity</w:t>
       </w:r>
     </w:p>
     <w:p>
       <w:r>
-        <w:t>Refitting M3 on the 2022-only panel changes forecast growth by a median of</w:t>
-      </w:r>
-    </w:p>
-    <w:p>
-      <w:r>
-        <w:t>0.033. The largest moves are Bhopal +0.41, Guwahati −0.26, Rajkot −0.26, Pune</w:t>
-      </w:r>
-    </w:p>
-    <w:p>
-      <w:r>
-        <w:t>−0.24, and Agra +0.20. For cities with a large 2021→2022 step (Guwahati,</w:t>
-      </w:r>
-    </w:p>
-    <w:p>
-      <w:r>
-        <w:t>Jabalpur, Rajkot), the 2022-only forecast is the more defensible one. The full</w:t>
-      </w:r>
-    </w:p>
-    <w:p>
-      <w:r>
-        <w:t>sensitivity is in model_m3_2022only.csv.</w:t>
+        <w:t>The rolling-origin experiment is the defensible sensitivity: it estimates the</w:t>
+      </w:r>
+    </w:p>
+    <w:p>
+      <w:r>
+        <w:t>correction on an earlier window and evaluates it on the current holdout. It</w:t>
+      </w:r>
+    </w:p>
+    <w:p>
+      <w:r>
+        <w:t>reduces the median bias from −22% to +14% and the median RMSE from 477 to 381</w:t>
+      </w:r>
+    </w:p>
+    <w:p>
+      <w:r>
+        <w:t>(reports/improvement_m3.md, data/processed/improvement_m3.csv). For cities</w:t>
+      </w:r>
+    </w:p>
+    <w:p>
+      <w:r>
+        <w:t>with a large 2021→2022 step (Guwahati, Jabalpur, Rajkot), the 2022-only</w:t>
+      </w:r>
+    </w:p>
+    <w:p>
+      <w:r>
+        <w:t>forecast remains the more defensible one; the seam diagnostics are in</w:t>
+      </w:r>
+    </w:p>
+    <w:p>
+      <w:r>
+        <w:t>reports/seam_2021_2022.csv.</w:t>
       </w:r>
     </w:p>
     <w:p>
@@ -4611,7 +5072,7 @@
           </w:tcPr>
           <w:p>
             <w:r>
-              <w:t>Bengaluru</w:t>
+              <w:t>Delhi</w:t>
             </w:r>
           </w:p>
         </w:tc>
@@ -4621,7 +5082,7 @@
           </w:tcPr>
           <w:p>
             <w:r>
-              <w:t>1.702</w:t>
+              <w:t>1.816</w:t>
             </w:r>
           </w:p>
         </w:tc>
@@ -4653,7 +5114,7 @@
           </w:tcPr>
           <w:p>
             <w:r>
-              <w:t>Jaipur</w:t>
+              <w:t>Bengaluru</w:t>
             </w:r>
           </w:p>
         </w:tc>
@@ -4663,7 +5124,7 @@
           </w:tcPr>
           <w:p>
             <w:r>
-              <w:t>1.513</w:t>
+              <w:t>1.616</w:t>
             </w:r>
           </w:p>
         </w:tc>
@@ -4695,7 +5156,7 @@
           </w:tcPr>
           <w:p>
             <w:r>
-              <w:t>Delhi</w:t>
+              <w:t>Pune</w:t>
             </w:r>
           </w:p>
         </w:tc>
@@ -4705,7 +5166,7 @@
           </w:tcPr>
           <w:p>
             <w:r>
-              <w:t>1.498</w:t>
+              <w:t>0.959</w:t>
             </w:r>
           </w:p>
         </w:tc>
@@ -4737,7 +5198,7 @@
           </w:tcPr>
           <w:p>
             <w:r>
-              <w:t>Pune</w:t>
+              <w:t>Guwahati</w:t>
             </w:r>
           </w:p>
         </w:tc>
@@ -4747,7 +5208,7 @@
           </w:tcPr>
           <w:p>
             <w:r>
-              <w:t>1.354</w:t>
+              <w:t>0.935</w:t>
             </w:r>
           </w:p>
         </w:tc>
@@ -4779,7 +5240,7 @@
           </w:tcPr>
           <w:p>
             <w:r>
-              <w:t>Rajkot</w:t>
+              <w:t>Jaipur</w:t>
             </w:r>
           </w:p>
         </w:tc>
@@ -4789,7 +5250,7 @@
           </w:tcPr>
           <w:p>
             <w:r>
-              <w:t>0.734</w:t>
+              <w:t>0.826</w:t>
             </w:r>
           </w:p>
         </w:tc>
@@ -4799,7 +5260,7 @@
           </w:tcPr>
           <w:p>
             <w:r>
-              <w:t>Moderate — monitor and plan</w:t>
+              <w:t>High — prioritise in the next wave</w:t>
             </w:r>
           </w:p>
         </w:tc>
@@ -4831,7 +5292,7 @@
           </w:tcPr>
           <w:p>
             <w:r>
-              <w:t>0.719</w:t>
+              <w:t>0.677</w:t>
             </w:r>
           </w:p>
         </w:tc>
@@ -4863,7 +5324,7 @@
           </w:tcPr>
           <w:p>
             <w:r>
-              <w:t>Hyderabad</w:t>
+              <w:t>Ranchi</w:t>
             </w:r>
           </w:p>
         </w:tc>
@@ -4873,7 +5334,7 @@
           </w:tcPr>
           <w:p>
             <w:r>
-              <w:t>0.634</w:t>
+              <w:t>0.670</w:t>
             </w:r>
           </w:p>
         </w:tc>
@@ -4905,7 +5366,7 @@
           </w:tcPr>
           <w:p>
             <w:r>
-              <w:t>Noida</w:t>
+              <w:t>Lucknow</w:t>
             </w:r>
           </w:p>
         </w:tc>
@@ -4915,7 +5376,7 @@
           </w:tcPr>
           <w:p>
             <w:r>
-              <w:t>0.541</w:t>
+              <w:t>0.637</w:t>
             </w:r>
           </w:p>
         </w:tc>
@@ -4947,7 +5408,7 @@
           </w:tcPr>
           <w:p>
             <w:r>
-              <w:t>Lucknow</w:t>
+              <w:t>Surat</w:t>
             </w:r>
           </w:p>
         </w:tc>
@@ -4957,7 +5418,7 @@
           </w:tcPr>
           <w:p>
             <w:r>
-              <w:t>0.484</w:t>
+              <w:t>0.633</w:t>
             </w:r>
           </w:p>
         </w:tc>
@@ -4989,7 +5450,7 @@
           </w:tcPr>
           <w:p>
             <w:r>
-              <w:t>Guwahati</w:t>
+              <w:t>Hyderabad</w:t>
             </w:r>
           </w:p>
         </w:tc>
@@ -4999,7 +5460,7 @@
           </w:tcPr>
           <w:p>
             <w:r>
-              <w:t>0.401</w:t>
+              <w:t>0.516</w:t>
             </w:r>
           </w:p>
         </w:tc>
@@ -5031,7 +5492,7 @@
           </w:tcPr>
           <w:p>
             <w:r>
-              <w:t>Patna</w:t>
+              <w:t>Rajkot</w:t>
             </w:r>
           </w:p>
         </w:tc>
@@ -5041,7 +5502,7 @@
           </w:tcPr>
           <w:p>
             <w:r>
-              <w:t>0.389</w:t>
+              <w:t>0.489</w:t>
             </w:r>
           </w:p>
         </w:tc>
@@ -5073,7 +5534,7 @@
           </w:tcPr>
           <w:p>
             <w:r>
-              <w:t>Nashik</w:t>
+              <w:t>Patna</w:t>
             </w:r>
           </w:p>
         </w:tc>
@@ -5083,7 +5544,7 @@
           </w:tcPr>
           <w:p>
             <w:r>
-              <w:t>0.365</w:t>
+              <w:t>0.428</w:t>
             </w:r>
           </w:p>
         </w:tc>
@@ -5115,7 +5576,7 @@
           </w:tcPr>
           <w:p>
             <w:r>
-              <w:t>Gwalior</w:t>
+              <w:t>Ahmedabad</w:t>
             </w:r>
           </w:p>
         </w:tc>
@@ -5125,7 +5586,7 @@
           </w:tcPr>
           <w:p>
             <w:r>
-              <w:t>0.232</w:t>
+              <w:t>0.399</w:t>
             </w:r>
           </w:p>
         </w:tc>
@@ -5157,7 +5618,7 @@
           </w:tcPr>
           <w:p>
             <w:r>
-              <w:t>Indore</w:t>
+              <w:t>Noida</w:t>
             </w:r>
           </w:p>
         </w:tc>
@@ -5167,7 +5628,7 @@
           </w:tcPr>
           <w:p>
             <w:r>
-              <w:t>0.219</w:t>
+              <w:t>0.328</w:t>
             </w:r>
           </w:p>
         </w:tc>
@@ -5199,7 +5660,7 @@
           </w:tcPr>
           <w:p>
             <w:r>
-              <w:t>Ranchi</w:t>
+              <w:t>Indore</w:t>
             </w:r>
           </w:p>
         </w:tc>
@@ -5209,7 +5670,7 @@
           </w:tcPr>
           <w:p>
             <w:r>
-              <w:t>0.169</w:t>
+              <w:t>0.293</w:t>
             </w:r>
           </w:p>
         </w:tc>
@@ -5228,17 +5689,17 @@
     <w:p/>
     <w:p>
       <w:r>
-        <w:t>Bengaluru and Jaipur are the only Critical cities: both combine a high expected</w:t>
-      </w:r>
-    </w:p>
-    <w:p>
-      <w:r>
-        <w:t>monthly level with strong forecast growth. Delhi and Pune are High. The</w:t>
-      </w:r>
-    </w:p>
-    <w:p>
-      <w:r>
-        <w:t>remainder of the shortlist is Moderate; the full 51-city ranking is in</w:t>
+        <w:t>Delhi and Bengaluru are the only Critical cities: both combine a high expected</w:t>
+      </w:r>
+    </w:p>
+    <w:p>
+      <w:r>
+        <w:t>monthly level with strong forecast growth. Pune, Guwahati and Jaipur are High.</w:t>
+      </w:r>
+    </w:p>
+    <w:p>
+      <w:r>
+        <w:t>The remainder of the shortlist is Moderate; the full 51-city ranking is in</w:t>
       </w:r>
     </w:p>
     <w:p>
@@ -5335,7 +5796,7 @@
           </w:tcPr>
           <w:p>
             <w:r>
-              <w:t>15/15</w:t>
+              <w:t>14/15</w:t>
             </w:r>
           </w:p>
         </w:tc>
@@ -5345,7 +5806,7 @@
           </w:tcPr>
           <w:p>
             <w:r>
-              <w:t>–</w:t>
+              <w:t>Dehradun</w:t>
             </w:r>
           </w:p>
         </w:tc>
@@ -5355,7 +5816,7 @@
           </w:tcPr>
           <w:p>
             <w:r>
-              <w:t>–</w:t>
+              <w:t>Indore</w:t>
             </w:r>
           </w:p>
         </w:tc>
@@ -5377,7 +5838,7 @@
           </w:tcPr>
           <w:p>
             <w:r>
-              <w:t>14/15</w:t>
+              <w:t>15/15</w:t>
             </w:r>
           </w:p>
         </w:tc>
@@ -5387,7 +5848,7 @@
           </w:tcPr>
           <w:p>
             <w:r>
-              <w:t>Surat</w:t>
+              <w:t>–</w:t>
             </w:r>
           </w:p>
         </w:tc>
@@ -5397,7 +5858,7 @@
           </w:tcPr>
           <w:p>
             <w:r>
-              <w:t>Ranchi</w:t>
+              <w:t>–</w:t>
             </w:r>
           </w:p>
         </w:tc>
@@ -5429,7 +5890,7 @@
           </w:tcPr>
           <w:p>
             <w:r>
-              <w:t>Surat</w:t>
+              <w:t>Dehradun</w:t>
             </w:r>
           </w:p>
         </w:tc>
@@ -5439,7 +5900,7 @@
           </w:tcPr>
           <w:p>
             <w:r>
-              <w:t>Ranchi</w:t>
+              <w:t>Indore</w:t>
             </w:r>
           </w:p>
         </w:tc>
@@ -5461,7 +5922,7 @@
           </w:tcPr>
           <w:p>
             <w:r>
-              <w:t>14/15</w:t>
+              <w:t>15/15</w:t>
             </w:r>
           </w:p>
         </w:tc>
@@ -5471,7 +5932,7 @@
           </w:tcPr>
           <w:p>
             <w:r>
-              <w:t>Allahabad (Prayagraj)</w:t>
+              <w:t>–</w:t>
             </w:r>
           </w:p>
         </w:tc>
@@ -5481,7 +5942,7 @@
           </w:tcPr>
           <w:p>
             <w:r>
-              <w:t>Ranchi</w:t>
+              <w:t>–</w:t>
             </w:r>
           </w:p>
         </w:tc>
@@ -5503,7 +5964,7 @@
           </w:tcPr>
           <w:p>
             <w:r>
-              <w:t>14/15</w:t>
+              <w:t>15/15</w:t>
             </w:r>
           </w:p>
         </w:tc>
@@ -5513,7 +5974,7 @@
           </w:tcPr>
           <w:p>
             <w:r>
-              <w:t>Allahabad (Prayagraj)</w:t>
+              <w:t>–</w:t>
             </w:r>
           </w:p>
         </w:tc>
@@ -5523,7 +5984,7 @@
           </w:tcPr>
           <w:p>
             <w:r>
-              <w:t>Ranchi</w:t>
+              <w:t>–</w:t>
             </w:r>
           </w:p>
         </w:tc>
@@ -5555,7 +6016,7 @@
           </w:tcPr>
           <w:p>
             <w:r>
-              <w:t>Madurai</w:t>
+              <w:t>Dehradun</w:t>
             </w:r>
           </w:p>
         </w:tc>

</xml_diff>